<commit_message>
Commit 2. Charla en equipo
despues de haber tomado una desicion, hablamos sobre que tan posible es nuestro proyecto.
</commit_message>
<xml_diff>
--- a/Tercer_semana_de_Técnicas_de_Inteligencia_Artificial-JosèArmandoVillalobosPuga.docx
+++ b/Tercer_semana_de_Técnicas_de_Inteligencia_Artificial-JosèArmandoVillalobosPuga.docx
@@ -48,6 +48,36 @@
           <w:rtl w:val="0"/>
         </w:rPr>
         <w:t xml:space="preserve"> En el día Martes 8 de septiembre hicimos nos reunimos con nuestro equipo correspondiente para ponernos de acuerdo con el proyecto que vamos a llevar a cabo.</w:t>
+      </w:r>
+    </w:p>
+    <w:p>
+      <w:pPr>
+        <w:rPr/>
+      </w:pPr>
+      <w:r>
+        <w:rPr>
+          <w:rtl w:val="0"/>
+        </w:rPr>
+      </w:r>
+    </w:p>
+    <w:p>
+      <w:pPr>
+        <w:rPr/>
+      </w:pPr>
+      <w:r>
+        <w:rPr>
+          <w:b w:val="1"/>
+          <w:bCs w:val="1"/>
+          <w:rtl w:val="0"/>
+        </w:rPr>
+        <w:t xml:space="preserve">Actividad 2:</w:t>
+      </w:r>
+      <w:r>
+        <w:rPr>
+          <w:rtl w:val="0"/>
+        </w:rPr>
+        <w:t xml:space="preserve"> En el día Martes 8 de septiembre después de haber tomado una decisión sobre el proyecto final con nuestro equipo correspondiente, empezamos a discutir sobre presupuestos y que tan posible es llevarlo a la realidad.</w:t>
+        <w:br w:type="textWrapping"/>
         <w:br w:type="textWrapping"/>
       </w:r>
     </w:p>

</xml_diff>